<commit_message>
Update agent configurations and refine desktop installer logic
Replit-Commit-Author: Agent
</commit_message>
<xml_diff>
--- a/attached_assets/SWIMNOTE_OFFICE_V1_전체개발_고정계획서_V1.0_20261015_1792084020980.docx
+++ b/attached_assets/SWIMNOTE_OFFICE_V1_전체개발_고정계획서_V1.0_20261015_1792084020980.docx
@@ -23670,6 +23670,21 @@
           <w:sz w:val="18"/>
         </w:rPr>
         <w:t>— SWIMNOTE OFFICE V1 전체개발 고정계획서 V1.0 끝 —</w:t>
+      </w:r>
+    </w:p>
+    <w:p>
+      <w:r>
+        <w:t>후속 보완 참조 — 2026-10-17</w:t>
+      </w:r>
+    </w:p>
+    <w:p>
+      <w:r>
+        <w:t>회원·운영 업무 구현설계 보완 V1: docs/office/member-operations-design-v1.md</w:t>
+      </w:r>
+    </w:p>
+    <w:p>
+      <w:r>
+        <w:t>원래 계획의 변경이 아닌 상세화·추가 요구다. Stage 1~10 순서와 제품 목표 및 위 원문 이력을 보존한다. 이번 범위는 넓은 회원 상세 조회·공통 Navigation/Action·로컬 검증·내부 설치본 1회 전달이며 회원 수정·반이동·실제 AI는 자동 재개하지 않는다. AGENTS.md·replit.md의 필수 참조를 함께 따른다.</w:t>
       </w:r>
     </w:p>
     <w:sectPr>

</xml_diff>